<commit_message>
Versión inicial limpia para la nube
</commit_message>
<xml_diff>
--- a/plantilla_cotizacion.docx
+++ b/plantilla_cotizacion.docx
@@ -11,10 +11,160 @@
         <w:rPr>
           <w:noProof/>
         </w:rPr>
+        <w:drawing>
+          <wp:anchor distT="0" distB="0" distL="114300" distR="114300" simplePos="0" relativeHeight="251674624" behindDoc="0" locked="0" layoutInCell="1" allowOverlap="1" wp14:anchorId="6201523E" wp14:editId="0856783C">
+            <wp:simplePos x="0" y="0"/>
+            <wp:positionH relativeFrom="margin">
+              <wp:posOffset>69215</wp:posOffset>
+            </wp:positionH>
+            <wp:positionV relativeFrom="paragraph">
+              <wp:posOffset>-53340</wp:posOffset>
+            </wp:positionV>
+            <wp:extent cx="1020445" cy="1020445"/>
+            <wp:effectExtent l="0" t="0" r="8255" b="8255"/>
+            <wp:wrapNone/>
+            <wp:docPr id="936739464" name="Imagen 42"/>
+            <wp:cNvGraphicFramePr>
+              <a:graphicFrameLocks xmlns:a="http://schemas.openxmlformats.org/drawingml/2006/main" noChangeAspect="1"/>
+            </wp:cNvGraphicFramePr>
+            <a:graphic xmlns:a="http://schemas.openxmlformats.org/drawingml/2006/main">
+              <a:graphicData uri="http://schemas.openxmlformats.org/drawingml/2006/picture">
+                <pic:pic xmlns:pic="http://schemas.openxmlformats.org/drawingml/2006/picture">
+                  <pic:nvPicPr>
+                    <pic:cNvPr id="0" name="Picture 6"/>
+                    <pic:cNvPicPr>
+                      <a:picLocks noChangeAspect="1" noChangeArrowheads="1"/>
+                    </pic:cNvPicPr>
+                  </pic:nvPicPr>
+                  <pic:blipFill>
+                    <a:blip r:embed="rId7" cstate="print">
+                      <a:extLst>
+                        <a:ext uri="{28A0092B-C50C-407E-A947-70E740481C1C}">
+                          <a14:useLocalDpi xmlns:a14="http://schemas.microsoft.com/office/drawing/2010/main" val="0"/>
+                        </a:ext>
+                      </a:extLst>
+                    </a:blip>
+                    <a:srcRect/>
+                    <a:stretch>
+                      <a:fillRect/>
+                    </a:stretch>
+                  </pic:blipFill>
+                  <pic:spPr bwMode="auto">
+                    <a:xfrm>
+                      <a:off x="0" y="0"/>
+                      <a:ext cx="1020445" cy="1020445"/>
+                    </a:xfrm>
+                    <a:prstGeom prst="rect">
+                      <a:avLst/>
+                    </a:prstGeom>
+                    <a:noFill/>
+                    <a:ln>
+                      <a:noFill/>
+                    </a:ln>
+                  </pic:spPr>
+                </pic:pic>
+              </a:graphicData>
+            </a:graphic>
+            <wp14:sizeRelH relativeFrom="margin">
+              <wp14:pctWidth>0</wp14:pctWidth>
+            </wp14:sizeRelH>
+            <wp14:sizeRelV relativeFrom="margin">
+              <wp14:pctHeight>0</wp14:pctHeight>
+            </wp14:sizeRelV>
+          </wp:anchor>
+        </w:drawing>
+      </w:r>
+      <w:r>
+        <w:rPr>
+          <w:noProof/>
+        </w:rPr>
         <mc:AlternateContent>
           <mc:Choice Requires="wps">
             <w:drawing>
-              <wp:anchor distT="0" distB="0" distL="114300" distR="114300" simplePos="0" relativeHeight="251660288" behindDoc="0" locked="0" layoutInCell="1" allowOverlap="1" wp14:anchorId="6F2A2838" wp14:editId="77BE09E5">
+              <wp:anchor distT="0" distB="0" distL="114300" distR="114300" simplePos="0" relativeHeight="251675648" behindDoc="1" locked="0" layoutInCell="1" allowOverlap="1" wp14:anchorId="166B041A" wp14:editId="0DD1989E">
+                <wp:simplePos x="0" y="0"/>
+                <wp:positionH relativeFrom="page">
+                  <wp:align>left</wp:align>
+                </wp:positionH>
+                <wp:positionV relativeFrom="paragraph">
+                  <wp:posOffset>-312420</wp:posOffset>
+                </wp:positionV>
+                <wp:extent cx="7574280" cy="1374775"/>
+                <wp:effectExtent l="0" t="0" r="7620" b="0"/>
+                <wp:wrapNone/>
+                <wp:docPr id="902800087" name="Rectángulo 43"/>
+                <wp:cNvGraphicFramePr/>
+                <a:graphic xmlns:a="http://schemas.openxmlformats.org/drawingml/2006/main">
+                  <a:graphicData uri="http://schemas.microsoft.com/office/word/2010/wordprocessingShape">
+                    <wps:wsp>
+                      <wps:cNvSpPr/>
+                      <wps:spPr>
+                        <a:xfrm>
+                          <a:off x="0" y="0"/>
+                          <a:ext cx="7574280" cy="1374775"/>
+                        </a:xfrm>
+                        <a:prstGeom prst="rect">
+                          <a:avLst/>
+                        </a:prstGeom>
+                        <a:solidFill>
+                          <a:srgbClr val="F6F6F6"/>
+                        </a:solidFill>
+                        <a:ln>
+                          <a:noFill/>
+                        </a:ln>
+                      </wps:spPr>
+                      <wps:style>
+                        <a:lnRef idx="2">
+                          <a:schemeClr val="accent1">
+                            <a:shade val="15000"/>
+                          </a:schemeClr>
+                        </a:lnRef>
+                        <a:fillRef idx="1">
+                          <a:schemeClr val="accent1"/>
+                        </a:fillRef>
+                        <a:effectRef idx="0">
+                          <a:schemeClr val="accent1"/>
+                        </a:effectRef>
+                        <a:fontRef idx="minor">
+                          <a:schemeClr val="lt1"/>
+                        </a:fontRef>
+                      </wps:style>
+                      <wps:bodyPr rot="0" spcFirstLastPara="0" vertOverflow="overflow" horzOverflow="overflow" vert="horz" wrap="square" lIns="91440" tIns="45720" rIns="91440" bIns="45720" numCol="1" spcCol="0" rtlCol="0" fromWordArt="0" anchor="ctr" anchorCtr="0" forceAA="0" compatLnSpc="1">
+                        <a:prstTxWarp prst="textNoShape">
+                          <a:avLst/>
+                        </a:prstTxWarp>
+                        <a:noAutofit/>
+                      </wps:bodyPr>
+                    </wps:wsp>
+                  </a:graphicData>
+                </a:graphic>
+                <wp14:sizeRelH relativeFrom="margin">
+                  <wp14:pctWidth>0</wp14:pctWidth>
+                </wp14:sizeRelH>
+                <wp14:sizeRelV relativeFrom="margin">
+                  <wp14:pctHeight>0</wp14:pctHeight>
+                </wp14:sizeRelV>
+              </wp:anchor>
+            </w:drawing>
+          </mc:Choice>
+          <mc:Fallback>
+            <w:pict>
+              <v:rect w14:anchorId="1FC5A1B8" id="Rectángulo 43" o:spid="_x0000_s1026" style="position:absolute;margin-left:0;margin-top:-24.6pt;width:596.4pt;height:108.25pt;z-index:-251640832;visibility:visible;mso-wrap-style:square;mso-width-percent:0;mso-height-percent:0;mso-wrap-distance-left:9pt;mso-wrap-distance-top:0;mso-wrap-distance-right:9pt;mso-wrap-distance-bottom:0;mso-position-horizontal:left;mso-position-horizontal-relative:page;mso-position-vertical:absolute;mso-position-vertical-relative:text;mso-width-percent:0;mso-height-percent:0;mso-width-relative:margin;mso-height-relative:margin;v-text-anchor:middle" o:gfxdata="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" fillcolor="#f6f6f6" stroked="f" strokeweight="1pt">
+                <w10:wrap anchorx="page"/>
+              </v:rect>
+            </w:pict>
+          </mc:Fallback>
+        </mc:AlternateContent>
+      </w:r>
+      <w:r>
+        <w:rPr>
+          <w:noProof/>
+          <w:shd w:val="clear" w:color="auto" w:fill="AEAAAA" w:themeFill="background2" w:themeFillShade="BF"/>
+        </w:rPr>
+        <mc:AlternateContent>
+          <mc:Choice Requires="wps">
+            <w:drawing>
+              <wp:anchor distT="0" distB="0" distL="114300" distR="114300" simplePos="0" relativeHeight="251660288" behindDoc="0" locked="0" layoutInCell="1" allowOverlap="1" wp14:anchorId="6F2A2838" wp14:editId="3D50EE37">
                 <wp:simplePos x="0" y="0"/>
                 <wp:positionH relativeFrom="column">
                   <wp:posOffset>4086225</wp:posOffset>
@@ -101,6 +251,7 @@
       <w:r>
         <w:rPr>
           <w:noProof/>
+          <w:shd w:val="clear" w:color="auto" w:fill="AEAAAA" w:themeFill="background2" w:themeFillShade="BF"/>
         </w:rPr>
         <mc:AlternateContent>
           <mc:Choice Requires="wps">
@@ -290,6 +441,7 @@
       <w:r>
         <w:rPr>
           <w:noProof/>
+          <w:shd w:val="clear" w:color="auto" w:fill="AEAAAA" w:themeFill="background2" w:themeFillShade="BF"/>
         </w:rPr>
         <mc:AlternateContent>
           <mc:Choice Requires="wps">
@@ -446,6 +598,7 @@
       <w:r>
         <w:rPr>
           <w:noProof/>
+          <w:shd w:val="clear" w:color="auto" w:fill="AEAAAA" w:themeFill="background2" w:themeFillShade="BF"/>
         </w:rPr>
         <mc:AlternateContent>
           <mc:Choice Requires="wps">
@@ -599,6 +752,7 @@
       <w:r>
         <w:rPr>
           <w:noProof/>
+          <w:shd w:val="clear" w:color="auto" w:fill="AEAAAA" w:themeFill="background2" w:themeFillShade="BF"/>
         </w:rPr>
         <mc:AlternateContent>
           <mc:Choice Requires="wps">
@@ -788,6 +942,7 @@
       <w:r>
         <w:rPr>
           <w:noProof/>
+          <w:shd w:val="clear" w:color="auto" w:fill="AEAAAA" w:themeFill="background2" w:themeFillShade="BF"/>
         </w:rPr>
         <mc:AlternateContent>
           <mc:Choice Requires="wps">
@@ -871,7 +1026,7 @@
         <mc:AlternateContent>
           <mc:Choice Requires="wpg">
             <w:drawing>
-              <wp:inline distT="0" distB="0" distL="0" distR="0" wp14:anchorId="3E1CDECE" wp14:editId="36B9EF92">
+              <wp:inline distT="0" distB="0" distL="0" distR="0" wp14:anchorId="3E1CDECE" wp14:editId="136F0615">
                 <wp:extent cx="7162710" cy="2176195"/>
                 <wp:effectExtent l="0" t="0" r="0" b="0"/>
                 <wp:docPr id="1443" name="Group 1443"/>
@@ -1098,27 +1253,6 @@
                         </wps:style>
                         <wps:bodyPr/>
                       </wps:wsp>
-                      <pic:pic xmlns:pic="http://schemas.openxmlformats.org/drawingml/2006/picture">
-                        <pic:nvPicPr>
-                          <pic:cNvPr id="19" name="Picture 19"/>
-                          <pic:cNvPicPr/>
-                        </pic:nvPicPr>
-                        <pic:blipFill>
-                          <a:blip r:embed="rId5"/>
-                          <a:stretch>
-                            <a:fillRect/>
-                          </a:stretch>
-                        </pic:blipFill>
-                        <pic:spPr>
-                          <a:xfrm>
-                            <a:off x="47625" y="152400"/>
-                            <a:ext cx="1362075" cy="866775"/>
-                          </a:xfrm>
-                          <a:prstGeom prst="rect">
-                            <a:avLst/>
-                          </a:prstGeom>
-                        </pic:spPr>
-                      </pic:pic>
                       <wps:wsp>
                         <wps:cNvPr id="20" name="Rectangle 20"/>
                         <wps:cNvSpPr/>
@@ -1210,10 +1344,16 @@
                         <wps:txbx>
                           <w:txbxContent>
                             <w:p>
+                              <w:pPr>
+                                <w:rPr>
+                                  <w:lang w:val="en-US"/>
+                                </w:rPr>
+                              </w:pPr>
                               <w:r>
                                 <w:rPr>
                                   <w:rFonts w:ascii="Tahoma" w:eastAsia="Tahoma" w:hAnsi="Tahoma" w:cs="Tahoma"/>
                                   <w:sz w:val="16"/>
+                                  <w:lang w:val="en-US"/>
                                 </w:rPr>
                                 <w:t xml:space="preserve">Email: </w:t>
                               </w:r>
@@ -1221,15 +1361,9 @@
                                 <w:rPr>
                                   <w:rFonts w:ascii="Tahoma" w:eastAsia="Tahoma" w:hAnsi="Tahoma" w:cs="Tahoma"/>
                                   <w:sz w:val="16"/>
+                                  <w:lang w:val="en-US"/>
                                 </w:rPr>
-                                <w:t>Lcachay@importbolts.com</w:t>
-                              </w:r>
-                              <w:r>
-                                <w:rPr>
-                                  <w:rFonts w:ascii="Tahoma" w:eastAsia="Tahoma" w:hAnsi="Tahoma" w:cs="Tahoma"/>
-                                  <w:sz w:val="16"/>
-                                </w:rPr>
-                                <w:t xml:space="preserve"> – vtineo@importbolts.com</w:t>
+                                <w:t>Lcachay@importbolts.com – vtineo@importbolts.com</w:t>
                               </w:r>
                             </w:p>
                           </w:txbxContent>
@@ -1341,7 +1475,7 @@
                         <wps:cNvSpPr/>
                         <wps:spPr>
                           <a:xfrm>
-                            <a:off x="1602359" y="56706"/>
+                            <a:off x="1907159" y="64326"/>
                             <a:ext cx="4656267" cy="224076"/>
                           </a:xfrm>
                           <a:prstGeom prst="rect">
@@ -1359,7 +1493,14 @@
                                   <w:rFonts w:ascii="Tahoma" w:eastAsia="Tahoma" w:hAnsi="Tahoma" w:cs="Tahoma"/>
                                   <w:b/>
                                 </w:rPr>
-                                <w:t>IMPORT BOLTS &amp; ESTRUCTURE S.A.C.</w:t>
+                                <w:t xml:space="preserve">ANCLAJES Y PERNOS </w:t>
+                              </w:r>
+                              <w:r>
+                                <w:rPr>
+                                  <w:rFonts w:ascii="Tahoma" w:eastAsia="Tahoma" w:hAnsi="Tahoma" w:cs="Tahoma"/>
+                                  <w:b/>
+                                </w:rPr>
+                                <w:t>S.A.C.</w:t>
                               </w:r>
                             </w:p>
                           </w:txbxContent>
@@ -2386,7 +2527,7 @@
           </mc:Choice>
           <mc:Fallback>
             <w:pict>
-              <v:group w14:anchorId="3E1CDECE" id="Group 1443" o:spid="_x0000_s1032" style="width:564pt;height:171.35pt;mso-position-horizontal-relative:char;mso-position-vertical-relative:line" coordsize="71627,21761" o:gfxdata="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">
+              <v:group w14:anchorId="3E1CDECE" id="Group 1443" o:spid="_x0000_s1032" style="width:564pt;height:171.35pt;mso-position-horizontal-relative:char;mso-position-vertical-relative:line" coordsize="71627,21761" o:gfxdata="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">
                 <v:shape id="Shape 6" o:spid="_x0000_s1033" style="position:absolute;top:10668;width:67913;height:8667;visibility:visible;mso-wrap-style:square;v-text-anchor:top" coordsize="6791325,866775" o:gfxdata="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" path="m127000,l6664325,v127000,,127000,,127000,127000l6791325,739775v,127000,,127000,-127000,127000l127000,866775c,866775,,866775,,739775l,127000c,,,,127000,xe" filled="f" strokecolor="gray" strokeweight="1pt">
                   <v:stroke miterlimit="83231f" joinstyle="miter"/>
                   <v:path arrowok="t" textboxrect="0,0,6791325,866775"/>
@@ -2425,29 +2566,7 @@
                   <v:stroke miterlimit="83231f" joinstyle="miter"/>
                   <v:path arrowok="t" textboxrect="0,0,2085975,1047750"/>
                 </v:shape>
-                <v:shapetype id="_x0000_t75" coordsize="21600,21600" o:spt="75" o:preferrelative="t" path="m@4@5l@4@11@9@11@9@5xe" filled="f" stroked="f">
-                  <v:stroke joinstyle="miter"/>
-                  <v:formulas>
-                    <v:f eqn="if lineDrawn pixelLineWidth 0"/>
-                    <v:f eqn="sum @0 1 0"/>
-                    <v:f eqn="sum 0 0 @1"/>
-                    <v:f eqn="prod @2 1 2"/>
-                    <v:f eqn="prod @3 21600 pixelWidth"/>
-                    <v:f eqn="prod @3 21600 pixelHeight"/>
-                    <v:f eqn="sum @0 0 1"/>
-                    <v:f eqn="prod @6 1 2"/>
-                    <v:f eqn="prod @7 21600 pixelWidth"/>
-                    <v:f eqn="sum @8 21600 0"/>
-                    <v:f eqn="prod @7 21600 pixelHeight"/>
-                    <v:f eqn="sum @10 21600 0"/>
-                  </v:formulas>
-                  <v:path o:extrusionok="f" gradientshapeok="t" o:connecttype="rect"/>
-                  <o:lock v:ext="edit" aspectratio="t"/>
-                </v:shapetype>
-                <v:shape id="Picture 19" o:spid="_x0000_s1037" type="#_x0000_t75" style="position:absolute;left:476;top:1524;width:13621;height:8667;visibility:visible;mso-wrap-style:square" o:gfxdata="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">
-                  <v:imagedata r:id="rId6" o:title=""/>
-                </v:shape>
-                <v:rect id="Rectangle 20" o:spid="_x0000_s1038" style="position:absolute;left:18137;top:2511;width:23630;height:1203;visibility:visible;mso-wrap-style:square;v-text-anchor:top" o:gfxdata="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" filled="f" stroked="f">
+                <v:rect id="Rectangle 20" o:spid="_x0000_s1037" style="position:absolute;left:18137;top:2511;width:23630;height:1203;visibility:visible;mso-wrap-style:square;v-text-anchor:top" o:gfxdata="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" filled="f" stroked="f">
                   <v:textbox inset="0,0,0,0">
                     <w:txbxContent>
                       <w:p>
@@ -2462,7 +2581,7 @@
                     </w:txbxContent>
                   </v:textbox>
                 </v:rect>
-                <v:rect id="Rectangle 21" o:spid="_x0000_s1039" style="position:absolute;left:48887;top:1440;width:22740;height:2648;visibility:visible;mso-wrap-style:square;v-text-anchor:top" o:gfxdata="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" filled="f" stroked="f">
+                <v:rect id="Rectangle 21" o:spid="_x0000_s1038" style="position:absolute;left:48887;top:1440;width:22740;height:2648;visibility:visible;mso-wrap-style:square;v-text-anchor:top" o:gfxdata="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" filled="f" stroked="f">
                   <v:textbox inset="0,0,0,0">
                     <w:txbxContent>
                       <w:p>
@@ -2486,14 +2605,20 @@
                     </w:txbxContent>
                   </v:textbox>
                 </v:rect>
-                <v:rect id="Rectangle 22" o:spid="_x0000_s1040" style="position:absolute;left:16023;top:6667;width:27634;height:1524;visibility:visible;mso-wrap-style:square;v-text-anchor:top" o:gfxdata="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" filled="f" stroked="f">
+                <v:rect id="Rectangle 22" o:spid="_x0000_s1039" style="position:absolute;left:16023;top:6667;width:27634;height:1524;visibility:visible;mso-wrap-style:square;v-text-anchor:top" o:gfxdata="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" filled="f" stroked="f">
                   <v:textbox inset="0,0,0,0">
                     <w:txbxContent>
                       <w:p>
+                        <w:pPr>
+                          <w:rPr>
+                            <w:lang w:val="en-US"/>
+                          </w:rPr>
+                        </w:pPr>
                         <w:r>
                           <w:rPr>
                             <w:rFonts w:ascii="Tahoma" w:eastAsia="Tahoma" w:hAnsi="Tahoma" w:cs="Tahoma"/>
                             <w:sz w:val="16"/>
+                            <w:lang w:val="en-US"/>
                           </w:rPr>
                           <w:t xml:space="preserve">Email: </w:t>
                         </w:r>
@@ -2501,21 +2626,15 @@
                           <w:rPr>
                             <w:rFonts w:ascii="Tahoma" w:eastAsia="Tahoma" w:hAnsi="Tahoma" w:cs="Tahoma"/>
                             <w:sz w:val="16"/>
+                            <w:lang w:val="en-US"/>
                           </w:rPr>
-                          <w:t>Lcachay@importbolts.com</w:t>
-                        </w:r>
-                        <w:r>
-                          <w:rPr>
-                            <w:rFonts w:ascii="Tahoma" w:eastAsia="Tahoma" w:hAnsi="Tahoma" w:cs="Tahoma"/>
-                            <w:sz w:val="16"/>
-                          </w:rPr>
-                          <w:t xml:space="preserve"> – vtineo@importbolts.com</w:t>
+                          <w:t>Lcachay@importbolts.com – vtineo@importbolts.com</w:t>
                         </w:r>
                       </w:p>
                     </w:txbxContent>
                   </v:textbox>
                 </v:rect>
-                <v:rect id="Rectangle 23" o:spid="_x0000_s1041" style="position:absolute;left:51611;top:7747;width:18893;height:2444;visibility:visible;mso-wrap-style:square;v-text-anchor:top" o:gfxdata="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" filled="f" stroked="f">
+                <v:rect id="Rectangle 23" o:spid="_x0000_s1040" style="position:absolute;left:51611;top:7747;width:18893;height:2444;visibility:visible;mso-wrap-style:square;v-text-anchor:top" o:gfxdata="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" filled="f" stroked="f">
                   <v:textbox inset="0,0,0,0">
                     <w:txbxContent>
                       <w:p>
@@ -2596,7 +2715,7 @@
                     </w:txbxContent>
                   </v:textbox>
                 </v:rect>
-                <v:rect id="Rectangle 24" o:spid="_x0000_s1042" style="position:absolute;left:16023;top:567;width:46563;height:2240;visibility:visible;mso-wrap-style:square;v-text-anchor:top" o:gfxdata="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" filled="f" stroked="f">
+                <v:rect id="Rectangle 24" o:spid="_x0000_s1041" style="position:absolute;left:19071;top:643;width:46563;height:2241;visibility:visible;mso-wrap-style:square;v-text-anchor:top" o:gfxdata="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" filled="f" stroked="f">
                   <v:textbox inset="0,0,0,0">
                     <w:txbxContent>
                       <w:p>
@@ -2605,17 +2724,24 @@
                             <w:rFonts w:ascii="Tahoma" w:eastAsia="Tahoma" w:hAnsi="Tahoma" w:cs="Tahoma"/>
                             <w:b/>
                           </w:rPr>
-                          <w:t>IMPORT BOLTS &amp; ESTRUCTURE S.A.C.</w:t>
+                          <w:t xml:space="preserve">ANCLAJES Y PERNOS </w:t>
+                        </w:r>
+                        <w:r>
+                          <w:rPr>
+                            <w:rFonts w:ascii="Tahoma" w:eastAsia="Tahoma" w:hAnsi="Tahoma" w:cs="Tahoma"/>
+                            <w:b/>
+                          </w:rPr>
+                          <w:t>S.A.C.</w:t>
                         </w:r>
                       </w:p>
                     </w:txbxContent>
                   </v:textbox>
                 </v:rect>
-                <v:shape id="Shape 1846" o:spid="_x0000_s1043" style="position:absolute;left:47053;top:3524;width:20669;height:3810;visibility:visible;mso-wrap-style:square;v-text-anchor:top" coordsize="2066925,381000" o:gfxdata="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" path="m,l2066925,r,381000l,381000,,e" fillcolor="#f2f2f2" strokecolor="gray" strokeweight="1pt">
+                <v:shape id="Shape 1846" o:spid="_x0000_s1042" style="position:absolute;left:47053;top:3524;width:20669;height:3810;visibility:visible;mso-wrap-style:square;v-text-anchor:top" coordsize="2066925,381000" o:gfxdata="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" path="m,l2066925,r,381000l,381000,,e" fillcolor="#f2f2f2" strokecolor="gray" strokeweight="1pt">
                   <v:stroke miterlimit="83231f" joinstyle="miter"/>
                   <v:path arrowok="t" textboxrect="0,0,2066925,381000"/>
                 </v:shape>
-                <v:rect id="Rectangle 26" o:spid="_x0000_s1044" style="position:absolute;left:51060;top:4306;width:15439;height:2852;visibility:visible;mso-wrap-style:square;v-text-anchor:top" o:gfxdata="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" filled="f" stroked="f">
+                <v:rect id="Rectangle 26" o:spid="_x0000_s1043" style="position:absolute;left:51060;top:4306;width:15439;height:2852;visibility:visible;mso-wrap-style:square;v-text-anchor:top" o:gfxdata="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" filled="f" stroked="f">
                   <v:textbox inset="0,0,0,0">
                     <w:txbxContent>
                       <w:p>
@@ -2631,7 +2757,7 @@
                     </w:txbxContent>
                   </v:textbox>
                 </v:rect>
-                <v:rect id="Rectangle 27" o:spid="_x0000_s1045" style="position:absolute;left:26068;top:3844;width:7808;height:1630;visibility:visible;mso-wrap-style:square;v-text-anchor:top" o:gfxdata="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" filled="f" stroked="f">
+                <v:rect id="Rectangle 27" o:spid="_x0000_s1044" style="position:absolute;left:26068;top:3844;width:7808;height:1630;visibility:visible;mso-wrap-style:square;v-text-anchor:top" o:gfxdata="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" filled="f" stroked="f">
                   <v:textbox inset="0,0,0,0">
                     <w:txbxContent>
                       <w:p>
@@ -2646,7 +2772,7 @@
                     </w:txbxContent>
                   </v:textbox>
                 </v:rect>
-                <v:rect id="Rectangle 1062" o:spid="_x0000_s1046" style="position:absolute;left:8142;top:12408;width:23549;height:1629;visibility:visible;mso-wrap-style:square;v-text-anchor:top" o:gfxdata="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" filled="f" stroked="f">
+                <v:rect id="Rectangle 1062" o:spid="_x0000_s1045" style="position:absolute;left:8142;top:12408;width:23549;height:1629;visibility:visible;mso-wrap-style:square;v-text-anchor:top" o:gfxdata="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" filled="f" stroked="f">
                   <v:textbox inset="0,0,0,0">
                     <w:txbxContent>
                       <w:p>
@@ -2716,7 +2842,7 @@
                     </w:txbxContent>
                   </v:textbox>
                 </v:rect>
-                <v:rect id="Rectangle 1061" o:spid="_x0000_s1047" style="position:absolute;left:7524;top:12321;width:478;height:1630;visibility:visible;mso-wrap-style:square;v-text-anchor:top" o:gfxdata="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" filled="f" stroked="f">
+                <v:rect id="Rectangle 1061" o:spid="_x0000_s1046" style="position:absolute;left:7524;top:12321;width:478;height:1630;visibility:visible;mso-wrap-style:square;v-text-anchor:top" o:gfxdata="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" filled="f" stroked="f">
                   <v:textbox inset="0,0,0,0">
                     <w:txbxContent>
                       <w:p>
@@ -2731,7 +2857,7 @@
                     </w:txbxContent>
                   </v:textbox>
                 </v:rect>
-                <v:rect id="Rectangle 1063" o:spid="_x0000_s1048" style="position:absolute;left:7524;top:13655;width:478;height:1629;visibility:visible;mso-wrap-style:square;v-text-anchor:top" o:gfxdata="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" filled="f" stroked="f">
+                <v:rect id="Rectangle 1063" o:spid="_x0000_s1047" style="position:absolute;left:7524;top:13655;width:478;height:1629;visibility:visible;mso-wrap-style:square;v-text-anchor:top" o:gfxdata="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" filled="f" stroked="f">
                   <v:textbox inset="0,0,0,0">
                     <w:txbxContent>
                       <w:p>
@@ -2746,7 +2872,7 @@
                     </w:txbxContent>
                   </v:textbox>
                 </v:rect>
-                <v:rect id="Rectangle 1064" o:spid="_x0000_s1049" style="position:absolute;left:7883;top:13655;width:42976;height:1629;visibility:visible;mso-wrap-style:square;v-text-anchor:top" o:gfxdata="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" filled="f" stroked="f">
+                <v:rect id="Rectangle 1064" o:spid="_x0000_s1048" style="position:absolute;left:7883;top:13655;width:42976;height:1629;visibility:visible;mso-wrap-style:square;v-text-anchor:top" o:gfxdata="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" filled="f" stroked="f">
                   <v:textbox inset="0,0,0,0">
                     <w:txbxContent>
                       <w:p>
@@ -2809,7 +2935,7 @@
                     </w:txbxContent>
                   </v:textbox>
                 </v:rect>
-                <v:rect id="Rectangle 30" o:spid="_x0000_s1050" style="position:absolute;left:7524;top:16322;width:478;height:1629;visibility:visible;mso-wrap-style:square;v-text-anchor:top" o:gfxdata="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" filled="f" stroked="f">
+                <v:rect id="Rectangle 30" o:spid="_x0000_s1049" style="position:absolute;left:7524;top:16322;width:478;height:1629;visibility:visible;mso-wrap-style:square;v-text-anchor:top" o:gfxdata="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" filled="f" stroked="f">
                   <v:textbox inset="0,0,0,0">
                     <w:txbxContent>
                       <w:p>
@@ -2824,7 +2950,7 @@
                     </w:txbxContent>
                   </v:textbox>
                 </v:rect>
-                <v:rect id="Rectangle 31" o:spid="_x0000_s1051" style="position:absolute;left:190;top:12321;width:4206;height:1630;visibility:visible;mso-wrap-style:square;v-text-anchor:top" o:gfxdata="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" filled="f" stroked="f">
+                <v:rect id="Rectangle 31" o:spid="_x0000_s1050" style="position:absolute;left:190;top:12321;width:4206;height:1630;visibility:visible;mso-wrap-style:square;v-text-anchor:top" o:gfxdata="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" filled="f" stroked="f">
                   <v:textbox inset="0,0,0,0">
                     <w:txbxContent>
                       <w:p>
@@ -2839,7 +2965,7 @@
                     </w:txbxContent>
                   </v:textbox>
                 </v:rect>
-                <v:rect id="Rectangle 32" o:spid="_x0000_s1052" style="position:absolute;left:190;top:13655;width:6999;height:1629;visibility:visible;mso-wrap-style:square;v-text-anchor:top" o:gfxdata="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" filled="f" stroked="f">
+                <v:rect id="Rectangle 32" o:spid="_x0000_s1051" style="position:absolute;left:190;top:13655;width:6999;height:1629;visibility:visible;mso-wrap-style:square;v-text-anchor:top" o:gfxdata="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" filled="f" stroked="f">
                   <v:textbox inset="0,0,0,0">
                     <w:txbxContent>
                       <w:p>
@@ -2854,7 +2980,7 @@
                     </w:txbxContent>
                   </v:textbox>
                 </v:rect>
-                <v:rect id="Rectangle 33" o:spid="_x0000_s1053" style="position:absolute;left:95;top:16227;width:6492;height:1629;visibility:visible;mso-wrap-style:square;v-text-anchor:top" o:gfxdata="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" filled="f" stroked="f">
+                <v:rect id="Rectangle 33" o:spid="_x0000_s1052" style="position:absolute;left:95;top:16227;width:6492;height:1629;visibility:visible;mso-wrap-style:square;v-text-anchor:top" o:gfxdata="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" filled="f" stroked="f">
                   <v:textbox inset="0,0,0,0">
                     <w:txbxContent>
                       <w:p>
@@ -2869,7 +2995,7 @@
                     </w:txbxContent>
                   </v:textbox>
                 </v:rect>
-                <v:rect id="Rectangle 34" o:spid="_x0000_s1054" style="position:absolute;left:40957;top:16417;width:2283;height:1630;visibility:visible;mso-wrap-style:square;v-text-anchor:top" o:gfxdata="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" filled="f" stroked="f">
+                <v:rect id="Rectangle 34" o:spid="_x0000_s1053" style="position:absolute;left:40957;top:16417;width:2283;height:1630;visibility:visible;mso-wrap-style:square;v-text-anchor:top" o:gfxdata="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" filled="f" stroked="f">
                   <v:textbox inset="0,0,0,0">
                     <w:txbxContent>
                       <w:p>
@@ -2884,7 +3010,7 @@
                     </w:txbxContent>
                   </v:textbox>
                 </v:rect>
-                <v:rect id="_x0000_s1055" style="position:absolute;left:190;top:10988;width:3995;height:1629;visibility:visible;mso-wrap-style:square;v-text-anchor:top" o:gfxdata="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" filled="f" stroked="f">
+                <v:rect id="_x0000_s1054" style="position:absolute;left:190;top:10988;width:3995;height:1629;visibility:visible;mso-wrap-style:square;v-text-anchor:top" o:gfxdata="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" filled="f" stroked="f">
                   <v:textbox inset="0,0,0,0">
                     <w:txbxContent>
                       <w:p>
@@ -2899,7 +3025,7 @@
                     </w:txbxContent>
                   </v:textbox>
                 </v:rect>
-                <v:rect id="Rectangle 36" o:spid="_x0000_s1056" style="position:absolute;left:7524;top:14988;width:478;height:1630;visibility:visible;mso-wrap-style:square;v-text-anchor:top" o:gfxdata="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" filled="f" stroked="f">
+                <v:rect id="Rectangle 36" o:spid="_x0000_s1055" style="position:absolute;left:7524;top:14988;width:478;height:1630;visibility:visible;mso-wrap-style:square;v-text-anchor:top" o:gfxdata="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" filled="f" stroked="f">
                   <v:textbox inset="0,0,0,0">
                     <w:txbxContent>
                       <w:p>
@@ -2914,7 +3040,7 @@
                     </w:txbxContent>
                   </v:textbox>
                 </v:rect>
-                <v:rect id="_x0000_s1057" style="position:absolute;left:47339;top:16322;width:477;height:1629;visibility:visible;mso-wrap-style:square;v-text-anchor:top" o:gfxdata="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" filled="f" stroked="f">
+                <v:rect id="_x0000_s1056" style="position:absolute;left:47339;top:16322;width:477;height:1629;visibility:visible;mso-wrap-style:square;v-text-anchor:top" o:gfxdata="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" filled="f" stroked="f">
                   <v:textbox inset="0,0,0,0">
                     <w:txbxContent>
                       <w:p>
@@ -2929,7 +3055,7 @@
                     </w:txbxContent>
                   </v:textbox>
                 </v:rect>
-                <v:rect id="Rectangle 1058" o:spid="_x0000_s1058" style="position:absolute;left:7524;top:10988;width:478;height:1629;visibility:visible;mso-wrap-style:square;v-text-anchor:top" o:gfxdata="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" filled="f" stroked="f">
+                <v:rect id="Rectangle 1058" o:spid="_x0000_s1057" style="position:absolute;left:7524;top:10988;width:478;height:1629;visibility:visible;mso-wrap-style:square;v-text-anchor:top" o:gfxdata="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" filled="f" stroked="f">
                   <v:textbox inset="0,0,0,0">
                     <w:txbxContent>
                       <w:p>
@@ -2944,7 +3070,7 @@
                     </w:txbxContent>
                   </v:textbox>
                 </v:rect>
-                <v:rect id="Rectangle 1060" o:spid="_x0000_s1059" style="position:absolute;left:7883;top:10988;width:422;height:1629;visibility:visible;mso-wrap-style:square;v-text-anchor:top" o:gfxdata="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" filled="f" stroked="f">
+                <v:rect id="Rectangle 1060" o:spid="_x0000_s1058" style="position:absolute;left:7883;top:10988;width:422;height:1629;visibility:visible;mso-wrap-style:square;v-text-anchor:top" o:gfxdata="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" filled="f" stroked="f">
                   <v:textbox inset="0,0,0,0">
                     <w:txbxContent>
                       <w:p>
@@ -2959,7 +3085,7 @@
                     </w:txbxContent>
                   </v:textbox>
                 </v:rect>
-                <v:rect id="Rectangle 1059" o:spid="_x0000_s1060" style="position:absolute;left:8200;top:10988;width:6925;height:1629;visibility:visible;mso-wrap-style:square;v-text-anchor:top" o:gfxdata="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" filled="f" stroked="f">
+                <v:rect id="Rectangle 1059" o:spid="_x0000_s1059" style="position:absolute;left:8200;top:10988;width:6925;height:1629;visibility:visible;mso-wrap-style:square;v-text-anchor:top" o:gfxdata="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" filled="f" stroked="f">
                   <v:textbox inset="0,0,0,0">
                     <w:txbxContent>
                       <w:p>
@@ -2993,7 +3119,7 @@
                     </w:txbxContent>
                   </v:textbox>
                 </v:rect>
-                <v:rect id="_x0000_s1061" style="position:absolute;left:190;top:17560;width:6849;height:1630;visibility:visible;mso-wrap-style:square;v-text-anchor:top" o:gfxdata="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" filled="f" stroked="f">
+                <v:rect id="_x0000_s1060" style="position:absolute;left:190;top:17560;width:6849;height:1630;visibility:visible;mso-wrap-style:square;v-text-anchor:top" o:gfxdata="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" filled="f" stroked="f">
                   <v:textbox inset="0,0,0,0">
                     <w:txbxContent>
                       <w:p>
@@ -3008,7 +3134,7 @@
                     </w:txbxContent>
                   </v:textbox>
                 </v:rect>
-                <v:rect id="Rectangle 1065" o:spid="_x0000_s1062" style="position:absolute;left:7524;top:17655;width:478;height:1630;visibility:visible;mso-wrap-style:square;v-text-anchor:top" o:gfxdata="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" filled="f" stroked="f">
+                <v:rect id="Rectangle 1065" o:spid="_x0000_s1061" style="position:absolute;left:7524;top:17655;width:478;height:1630;visibility:visible;mso-wrap-style:square;v-text-anchor:top" o:gfxdata="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" filled="f" stroked="f">
                   <v:textbox inset="0,0,0,0">
                     <w:txbxContent>
                       <w:p>
@@ -3023,7 +3149,7 @@
                     </w:txbxContent>
                   </v:textbox>
                 </v:rect>
-                <v:rect id="Rectangle 1066" o:spid="_x0000_s1063" style="position:absolute;left:8002;top:17655;width:12215;height:1725;visibility:visible;mso-wrap-style:square;v-text-anchor:top" o:gfxdata="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" filled="f" stroked="f">
+                <v:rect id="Rectangle 1066" o:spid="_x0000_s1062" style="position:absolute;left:8002;top:17655;width:12215;height:1725;visibility:visible;mso-wrap-style:square;v-text-anchor:top" o:gfxdata="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" filled="f" stroked="f">
                   <v:textbox inset="0,0,0,0">
                     <w:txbxContent>
                       <w:p>
@@ -3082,7 +3208,7 @@
                     </w:txbxContent>
                   </v:textbox>
                 </v:rect>
-                <v:rect id="_x0000_s1064" style="position:absolute;left:47328;top:17750;width:12771;height:1534;visibility:visible;mso-wrap-style:square;v-text-anchor:top" o:gfxdata="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" filled="f" stroked="f">
+                <v:rect id="_x0000_s1063" style="position:absolute;left:47328;top:17750;width:12771;height:1534;visibility:visible;mso-wrap-style:square;v-text-anchor:top" o:gfxdata="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" filled="f" stroked="f">
                   <v:textbox inset="0,0,0,0">
                     <w:txbxContent>
                       <w:p>
@@ -3145,7 +3271,7 @@
                     </w:txbxContent>
                   </v:textbox>
                 </v:rect>
-                <v:rect id="Rectangle 42" o:spid="_x0000_s1065" style="position:absolute;left:40957;top:17751;width:6452;height:1629;visibility:visible;mso-wrap-style:square;v-text-anchor:top" o:gfxdata="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" filled="f" stroked="f">
+                <v:rect id="Rectangle 42" o:spid="_x0000_s1064" style="position:absolute;left:40957;top:17751;width:6452;height:1629;visibility:visible;mso-wrap-style:square;v-text-anchor:top" o:gfxdata="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" filled="f" stroked="f">
                   <v:textbox inset="0,0,0,0">
                     <w:txbxContent>
                       <w:p>
@@ -3160,7 +3286,7 @@
                     </w:txbxContent>
                   </v:textbox>
                 </v:rect>
-                <v:rect id="Rectangle 43" o:spid="_x0000_s1066" style="position:absolute;left:16023;top:5208;width:33470;height:1950;visibility:visible;mso-wrap-style:square;v-text-anchor:top" o:gfxdata="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" filled="f" stroked="f">
+                <v:rect id="Rectangle 43" o:spid="_x0000_s1065" style="position:absolute;left:16023;top:5208;width:33470;height:1950;visibility:visible;mso-wrap-style:square;v-text-anchor:top" o:gfxdata="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" filled="f" stroked="f">
                   <v:textbox inset="0,0,0,0">
                     <w:txbxContent>
                       <w:p>
@@ -3492,28 +3618,50 @@
               <w:rPr>
                 <w:sz w:val="2"/>
                 <w:szCs w:val="2"/>
+                <w:lang w:val="en-US"/>
               </w:rPr>
             </w:pPr>
             <w:r>
               <w:rPr>
                 <w:sz w:val="2"/>
                 <w:szCs w:val="2"/>
-              </w:rPr>
-              <w:t xml:space="preserve">{% for i in </w:t>
+                <w:lang w:val="en-US"/>
+              </w:rPr>
+              <w:t xml:space="preserve">{% for </w:t>
             </w:r>
             <w:proofErr w:type="spellStart"/>
             <w:r>
               <w:rPr>
                 <w:sz w:val="2"/>
                 <w:szCs w:val="2"/>
-              </w:rPr>
-              <w:t>tbl_contents</w:t>
+                <w:lang w:val="en-US"/>
+              </w:rPr>
+              <w:t>i</w:t>
             </w:r>
             <w:proofErr w:type="spellEnd"/>
             <w:r>
               <w:rPr>
                 <w:sz w:val="2"/>
                 <w:szCs w:val="2"/>
+                <w:lang w:val="en-US"/>
+              </w:rPr>
+              <w:t xml:space="preserve"> in </w:t>
+            </w:r>
+            <w:proofErr w:type="spellStart"/>
+            <w:r>
+              <w:rPr>
+                <w:sz w:val="2"/>
+                <w:szCs w:val="2"/>
+                <w:lang w:val="en-US"/>
+              </w:rPr>
+              <w:t>tbl_contents</w:t>
+            </w:r>
+            <w:proofErr w:type="spellEnd"/>
+            <w:r>
+              <w:rPr>
+                <w:sz w:val="2"/>
+                <w:szCs w:val="2"/>
+                <w:lang w:val="en-US"/>
               </w:rPr>
               <w:t xml:space="preserve"> %}</w:t>
             </w:r>
@@ -3538,6 +3686,7 @@
               <w:rPr>
                 <w:sz w:val="2"/>
                 <w:szCs w:val="2"/>
+                <w:lang w:val="en-US"/>
               </w:rPr>
             </w:pPr>
           </w:p>
@@ -3561,6 +3710,7 @@
               <w:rPr>
                 <w:sz w:val="2"/>
                 <w:szCs w:val="2"/>
+                <w:lang w:val="en-US"/>
               </w:rPr>
             </w:pPr>
           </w:p>
@@ -3580,6 +3730,7 @@
               <w:rPr>
                 <w:sz w:val="2"/>
                 <w:szCs w:val="2"/>
+                <w:lang w:val="en-US"/>
               </w:rPr>
             </w:pPr>
           </w:p>
@@ -3604,6 +3755,7 @@
               <w:rPr>
                 <w:sz w:val="2"/>
                 <w:szCs w:val="2"/>
+                <w:lang w:val="en-US"/>
               </w:rPr>
             </w:pPr>
           </w:p>
@@ -3628,6 +3780,7 @@
               <w:rPr>
                 <w:sz w:val="2"/>
                 <w:szCs w:val="2"/>
+                <w:lang w:val="en-US"/>
               </w:rPr>
             </w:pPr>
           </w:p>
@@ -3651,6 +3804,7 @@
               <w:rPr>
                 <w:sz w:val="2"/>
                 <w:szCs w:val="2"/>
+                <w:lang w:val="en-US"/>
               </w:rPr>
             </w:pPr>
           </w:p>
@@ -3686,7 +3840,15 @@
                 <w:sz w:val="18"/>
                 <w:szCs w:val="18"/>
               </w:rPr>
-              <w:t>{{ i</w:t>
+              <w:t xml:space="preserve">{{ </w:t>
+            </w:r>
+            <w:proofErr w:type="spellStart"/>
+            <w:r>
+              <w:rPr>
+                <w:sz w:val="18"/>
+                <w:szCs w:val="18"/>
+              </w:rPr>
+              <w:t>i</w:t>
             </w:r>
             <w:proofErr w:type="gramEnd"/>
             <w:r>
@@ -3694,7 +3856,15 @@
                 <w:sz w:val="18"/>
                 <w:szCs w:val="18"/>
               </w:rPr>
-              <w:t>.item }}</w:t>
+              <w:t>.item</w:t>
+            </w:r>
+            <w:proofErr w:type="spellEnd"/>
+            <w:r>
+              <w:rPr>
+                <w:sz w:val="18"/>
+                <w:szCs w:val="18"/>
+              </w:rPr>
+              <w:t xml:space="preserve"> }}</w:t>
             </w:r>
           </w:p>
         </w:tc>
@@ -3724,8 +3894,17 @@
                 <w:sz w:val="18"/>
                 <w:szCs w:val="18"/>
               </w:rPr>
-              <w:t>{{ i.sku</w:t>
-            </w:r>
+              <w:t xml:space="preserve">{{ </w:t>
+            </w:r>
+            <w:proofErr w:type="spellStart"/>
+            <w:r>
+              <w:rPr>
+                <w:sz w:val="18"/>
+                <w:szCs w:val="18"/>
+              </w:rPr>
+              <w:t>i.sku</w:t>
+            </w:r>
+            <w:proofErr w:type="spellEnd"/>
             <w:proofErr w:type="gramEnd"/>
             <w:r>
               <w:rPr>
@@ -4914,7 +5093,7 @@
         <mc:AlternateContent>
           <mc:Choice Requires="wps">
             <w:drawing>
-              <wp:anchor distT="0" distB="0" distL="114300" distR="114300" simplePos="0" relativeHeight="251672576" behindDoc="0" locked="0" layoutInCell="1" allowOverlap="1" wp14:anchorId="1CD62D1E" wp14:editId="32BE28F2">
+              <wp:anchor distT="0" distB="0" distL="114300" distR="114300" simplePos="0" relativeHeight="251672576" behindDoc="0" locked="0" layoutInCell="1" allowOverlap="1" wp14:anchorId="1CD62D1E" wp14:editId="3474AE1E">
                 <wp:simplePos x="0" y="0"/>
                 <wp:positionH relativeFrom="margin">
                   <wp:align>left</wp:align>
@@ -5042,7 +5221,7 @@
           </mc:Choice>
           <mc:Fallback>
             <w:pict>
-              <v:rect w14:anchorId="1CD62D1E" id="Rectangle 39" o:spid="_x0000_s1067" style="position:absolute;margin-left:0;margin-top:.4pt;width:342.25pt;height:15.15pt;z-index:251672576;visibility:visible;mso-wrap-style:square;mso-width-percent:0;mso-height-percent:0;mso-wrap-distance-left:9pt;mso-wrap-distance-top:0;mso-wrap-distance-right:9pt;mso-wrap-distance-bottom:0;mso-position-horizontal:left;mso-position-horizontal-relative:margin;mso-position-vertical:absolute;mso-position-vertical-relative:text;mso-width-percent:0;mso-height-percent:0;mso-width-relative:margin;mso-height-relative:margin;v-text-anchor:top" o:gfxdata="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" filled="f" stroked="f">
+              <v:rect w14:anchorId="1CD62D1E" id="Rectangle 39" o:spid="_x0000_s1066" style="position:absolute;margin-left:0;margin-top:.4pt;width:342.25pt;height:15.15pt;z-index:251672576;visibility:visible;mso-wrap-style:square;mso-width-percent:0;mso-height-percent:0;mso-wrap-distance-left:9pt;mso-wrap-distance-top:0;mso-wrap-distance-right:9pt;mso-wrap-distance-bottom:0;mso-position-horizontal:left;mso-position-horizontal-relative:margin;mso-position-vertical:absolute;mso-position-vertical-relative:text;mso-width-percent:0;mso-height-percent:0;mso-width-relative:margin;mso-height-relative:margin;v-text-anchor:top" o:gfxdata="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" filled="f" stroked="f">
                 <v:textbox inset="0,0,0,0">
                   <w:txbxContent>
                     <w:p>
@@ -5647,7 +5826,7 @@
           <w:noProof/>
         </w:rPr>
         <w:drawing>
-          <wp:anchor distT="0" distB="0" distL="114300" distR="114300" simplePos="0" relativeHeight="251658240" behindDoc="0" locked="0" layoutInCell="1" allowOverlap="0" wp14:anchorId="2AB5A961" wp14:editId="3BD5CF85">
+          <wp:anchor distT="0" distB="0" distL="114300" distR="114300" simplePos="0" relativeHeight="251658240" behindDoc="0" locked="0" layoutInCell="1" allowOverlap="0" wp14:anchorId="2AB5A961" wp14:editId="43CE0246">
             <wp:simplePos x="0" y="0"/>
             <wp:positionH relativeFrom="column">
               <wp:posOffset>142875</wp:posOffset>
@@ -5668,7 +5847,7 @@
                     <pic:cNvPicPr/>
                   </pic:nvPicPr>
                   <pic:blipFill>
-                    <a:blip r:embed="rId7"/>
+                    <a:blip r:embed="rId8"/>
                     <a:stretch>
                       <a:fillRect/>
                     </a:stretch>
@@ -5690,11 +5869,7 @@
       </w:r>
       <w:proofErr w:type="gramStart"/>
       <w:r>
-        <w:t xml:space="preserve">{{ </w:t>
-      </w:r>
-      <w:proofErr w:type="spellStart"/>
-      <w:r>
-        <w:t>vendedor</w:t>
+        <w:t>{{ vendedor</w:t>
       </w:r>
       <w:proofErr w:type="gramEnd"/>
       <w:r>
@@ -5702,11 +5877,7 @@
       </w:r>
       <w:proofErr w:type="gramStart"/>
       <w:r>
-        <w:t>nombre</w:t>
-      </w:r>
-      <w:proofErr w:type="spellEnd"/>
-      <w:r>
-        <w:t xml:space="preserve"> }</w:t>
+        <w:t>nombre }</w:t>
       </w:r>
       <w:proofErr w:type="gramEnd"/>
       <w:r>
@@ -5889,6 +6060,20 @@
         <w:tab/>
       </w:r>
     </w:p>
+    <w:p>
+      <w:pPr>
+        <w:tabs>
+          <w:tab w:val="left" w:pos="2160"/>
+        </w:tabs>
+      </w:pPr>
+    </w:p>
+    <w:p>
+      <w:pPr>
+        <w:tabs>
+          <w:tab w:val="left" w:pos="2160"/>
+        </w:tabs>
+      </w:pPr>
+    </w:p>
     <w:sectPr>
       <w:pgSz w:w="11907" w:h="16839"/>
       <w:pgMar w:top="480" w:right="1125" w:bottom="1440" w:left="659" w:header="720" w:footer="720" w:gutter="0"/>
@@ -5896,6 +6081,56 @@
     </w:sectPr>
   </w:body>
 </w:document>
+</file>
+
+<file path=word/endnotes.xml><?xml version="1.0" encoding="utf-8"?>
+<w:endnotes xmlns:wpc="http://schemas.microsoft.com/office/word/2010/wordprocessingCanvas" xmlns:cx="http://schemas.microsoft.com/office/drawing/2014/chartex" xmlns:cx1="http://schemas.microsoft.com/office/drawing/2015/9/8/chartex" xmlns:cx2="http://schemas.microsoft.com/office/drawing/2015/10/21/chartex" xmlns:cx3="http://schemas.microsoft.com/office/drawing/2016/5/9/chartex" xmlns:cx4="http://schemas.microsoft.com/office/drawing/2016/5/10/chartex" xmlns:cx5="http://schemas.microsoft.com/office/drawing/2016/5/11/chartex" xmlns:cx6="http://schemas.microsoft.com/office/drawing/2016/5/12/chartex" xmlns:cx7="http://schemas.microsoft.com/office/drawing/2016/5/13/chartex" xmlns:cx8="http://schemas.microsoft.com/office/drawing/2016/5/14/chartex" xmlns:mc="http://schemas.openxmlformats.org/markup-compatibility/2006" xmlns:aink="http://schemas.microsoft.com/office/drawing/2016/ink" xmlns:am3d="http://schemas.microsoft.com/office/drawing/2017/model3d" xmlns:o="urn:schemas-microsoft-com:office:office" xmlns:oel="http://schemas.microsoft.com/office/2019/extlst" xmlns:r="http://schemas.openxmlformats.org/officeDocument/2006/relationships" xmlns:m="http://schemas.openxmlformats.org/officeDocument/2006/math" xmlns:v="urn:schemas-microsoft-com:vml" xmlns:wp14="http://schemas.microsoft.com/office/word/2010/wordprocessingDrawing" xmlns:wp="http://schemas.openxmlformats.org/drawingml/2006/wordprocessingDrawing" xmlns:w10="urn:schemas-microsoft-com:office:word" xmlns:w="http://schemas.openxmlformats.org/wordprocessingml/2006/main" xmlns:w14="http://schemas.microsoft.com/office/word/2010/wordml" xmlns:w15="http://schemas.microsoft.com/office/word/2012/wordml" xmlns:w16cex="http://schemas.microsoft.com/office/word/2018/wordml/cex" xmlns:w16cid="http://schemas.microsoft.com/office/word/2016/wordml/cid" xmlns:w16="http://schemas.microsoft.com/office/word/2018/wordml" xmlns:w16du="http://schemas.microsoft.com/office/word/2023/wordml/word16du" xmlns:w16sdtdh="http://schemas.microsoft.com/office/word/2020/wordml/sdtdatahash" xmlns:w16sdtfl="http://schemas.microsoft.com/office/word/2024/wordml/sdtformatlock" xmlns:w16se="http://schemas.microsoft.com/office/word/2015/wordml/symex" xmlns:wpg="http://schemas.microsoft.com/office/word/2010/wordprocessingGroup" xmlns:wpi="http://schemas.microsoft.com/office/word/2010/wordprocessingInk" xmlns:wne="http://schemas.microsoft.com/office/word/2006/wordml" xmlns:wps="http://schemas.microsoft.com/office/word/2010/wordprocessingShape" mc:Ignorable="w14 w15 w16se w16cid w16 w16cex w16sdtdh w16sdtfl w16du wp14">
+  <w:endnote w:type="separator" w:id="-1">
+    <w:p>
+      <w:pPr>
+        <w:spacing w:after="0" w:line="240" w:lineRule="auto"/>
+      </w:pPr>
+      <w:r>
+        <w:separator/>
+      </w:r>
+    </w:p>
+  </w:endnote>
+  <w:endnote w:type="continuationSeparator" w:id="0">
+    <w:p>
+      <w:pPr>
+        <w:spacing w:after="0" w:line="240" w:lineRule="auto"/>
+      </w:pPr>
+      <w:r>
+        <w:continuationSeparator/>
+      </w:r>
+    </w:p>
+  </w:endnote>
+</w:endnotes>
+</file>
+
+<file path=word/footnotes.xml><?xml version="1.0" encoding="utf-8"?>
+<w:footnotes xmlns:wpc="http://schemas.microsoft.com/office/word/2010/wordprocessingCanvas" xmlns:cx="http://schemas.microsoft.com/office/drawing/2014/chartex" xmlns:cx1="http://schemas.microsoft.com/office/drawing/2015/9/8/chartex" xmlns:cx2="http://schemas.microsoft.com/office/drawing/2015/10/21/chartex" xmlns:cx3="http://schemas.microsoft.com/office/drawing/2016/5/9/chartex" xmlns:cx4="http://schemas.microsoft.com/office/drawing/2016/5/10/chartex" xmlns:cx5="http://schemas.microsoft.com/office/drawing/2016/5/11/chartex" xmlns:cx6="http://schemas.microsoft.com/office/drawing/2016/5/12/chartex" xmlns:cx7="http://schemas.microsoft.com/office/drawing/2016/5/13/chartex" xmlns:cx8="http://schemas.microsoft.com/office/drawing/2016/5/14/chartex" xmlns:mc="http://schemas.openxmlformats.org/markup-compatibility/2006" xmlns:aink="http://schemas.microsoft.com/office/drawing/2016/ink" xmlns:am3d="http://schemas.microsoft.com/office/drawing/2017/model3d" xmlns:o="urn:schemas-microsoft-com:office:office" xmlns:oel="http://schemas.microsoft.com/office/2019/extlst" xmlns:r="http://schemas.openxmlformats.org/officeDocument/2006/relationships" xmlns:m="http://schemas.openxmlformats.org/officeDocument/2006/math" xmlns:v="urn:schemas-microsoft-com:vml" xmlns:wp14="http://schemas.microsoft.com/office/word/2010/wordprocessingDrawing" xmlns:wp="http://schemas.openxmlformats.org/drawingml/2006/wordprocessingDrawing" xmlns:w10="urn:schemas-microsoft-com:office:word" xmlns:w="http://schemas.openxmlformats.org/wordprocessingml/2006/main" xmlns:w14="http://schemas.microsoft.com/office/word/2010/wordml" xmlns:w15="http://schemas.microsoft.com/office/word/2012/wordml" xmlns:w16cex="http://schemas.microsoft.com/office/word/2018/wordml/cex" xmlns:w16cid="http://schemas.microsoft.com/office/word/2016/wordml/cid" xmlns:w16="http://schemas.microsoft.com/office/word/2018/wordml" xmlns:w16du="http://schemas.microsoft.com/office/word/2023/wordml/word16du" xmlns:w16sdtdh="http://schemas.microsoft.com/office/word/2020/wordml/sdtdatahash" xmlns:w16sdtfl="http://schemas.microsoft.com/office/word/2024/wordml/sdtformatlock" xmlns:w16se="http://schemas.microsoft.com/office/word/2015/wordml/symex" xmlns:wpg="http://schemas.microsoft.com/office/word/2010/wordprocessingGroup" xmlns:wpi="http://schemas.microsoft.com/office/word/2010/wordprocessingInk" xmlns:wne="http://schemas.microsoft.com/office/word/2006/wordml" xmlns:wps="http://schemas.microsoft.com/office/word/2010/wordprocessingShape" mc:Ignorable="w14 w15 w16se w16cid w16 w16cex w16sdtdh w16sdtfl w16du wp14">
+  <w:footnote w:type="separator" w:id="-1">
+    <w:p>
+      <w:pPr>
+        <w:spacing w:after="0" w:line="240" w:lineRule="auto"/>
+      </w:pPr>
+      <w:r>
+        <w:separator/>
+      </w:r>
+    </w:p>
+  </w:footnote>
+  <w:footnote w:type="continuationSeparator" w:id="0">
+    <w:p>
+      <w:pPr>
+        <w:spacing w:after="0" w:line="240" w:lineRule="auto"/>
+      </w:pPr>
+      <w:r>
+        <w:continuationSeparator/>
+      </w:r>
+    </w:p>
+  </w:footnote>
+</w:footnotes>
 </file>
 
 <file path=word/styles.xml><?xml version="1.0" encoding="utf-8"?>
@@ -6443,6 +6678,60 @@
       <w:szCs w:val="20"/>
     </w:rPr>
   </w:style>
+  <w:style w:type="paragraph" w:styleId="Encabezado">
+    <w:name w:val="header"/>
+    <w:basedOn w:val="Normal"/>
+    <w:link w:val="EncabezadoCar"/>
+    <w:uiPriority w:val="99"/>
+    <w:unhideWhenUsed/>
+    <w:rsid w:val="00132BCE"/>
+    <w:pPr>
+      <w:tabs>
+        <w:tab w:val="center" w:pos="4252"/>
+        <w:tab w:val="right" w:pos="8504"/>
+      </w:tabs>
+      <w:spacing w:after="0" w:line="240" w:lineRule="auto"/>
+    </w:pPr>
+  </w:style>
+  <w:style w:type="character" w:customStyle="1" w:styleId="EncabezadoCar">
+    <w:name w:val="Encabezado Car"/>
+    <w:basedOn w:val="Fuentedeprrafopredeter"/>
+    <w:link w:val="Encabezado"/>
+    <w:uiPriority w:val="99"/>
+    <w:rsid w:val="00132BCE"/>
+    <w:rPr>
+      <w:rFonts w:ascii="Calibri" w:eastAsia="Calibri" w:hAnsi="Calibri" w:cs="Calibri"/>
+      <w:color w:val="000000"/>
+      <w:sz w:val="22"/>
+    </w:rPr>
+  </w:style>
+  <w:style w:type="paragraph" w:styleId="Piedepgina">
+    <w:name w:val="footer"/>
+    <w:basedOn w:val="Normal"/>
+    <w:link w:val="PiedepginaCar"/>
+    <w:uiPriority w:val="99"/>
+    <w:unhideWhenUsed/>
+    <w:rsid w:val="00132BCE"/>
+    <w:pPr>
+      <w:tabs>
+        <w:tab w:val="center" w:pos="4252"/>
+        <w:tab w:val="right" w:pos="8504"/>
+      </w:tabs>
+      <w:spacing w:after="0" w:line="240" w:lineRule="auto"/>
+    </w:pPr>
+  </w:style>
+  <w:style w:type="character" w:customStyle="1" w:styleId="PiedepginaCar">
+    <w:name w:val="Pie de página Car"/>
+    <w:basedOn w:val="Fuentedeprrafopredeter"/>
+    <w:link w:val="Piedepgina"/>
+    <w:uiPriority w:val="99"/>
+    <w:rsid w:val="00132BCE"/>
+    <w:rPr>
+      <w:rFonts w:ascii="Calibri" w:eastAsia="Calibri" w:hAnsi="Calibri" w:cs="Calibri"/>
+      <w:color w:val="000000"/>
+      <w:sz w:val="22"/>
+    </w:rPr>
+  </w:style>
 </w:styles>
 </file>
 

</xml_diff>